<commit_message>
Add personal portfolio (Midas) panel to dashboard
New '我的持仓 / My Portfolio' section at the top: summary cards (total,
US, BIST, cash with daily P/L), allocation bar, and a holdings table.
US holdings (QQQ, VOO) update live via Finnhub; Turkish BIST holdings
(BIMAS, ASELS, ASTOR) and the TRY/USD rate are screenshot snapshots
(no free-tier real-time). Totals reconcile exactly to the broker
screenshot. Tutorial doc updated accordingly.
</commit_message>
<xml_diff>
--- a/Serenity-卡点仪表盘/使用教程.docx
+++ b/Serenity-卡点仪表盘/使用教程.docx
@@ -192,6 +192,59 @@
       </w:pPr>
       <w:r>
         <w:t>四、界面分区导览</w:t>
+      </w:r>
+    </w:p>
+    <w:p>
+      <w:pPr>
+        <w:pStyle w:val="Heading2"/>
+      </w:pPr>
+      <w:r>
+        <w:t>0. 我的持仓（My Portfolio · 置顶）</w:t>
+      </w:r>
+    </w:p>
+    <w:p>
+      <w:r>
+        <w:rPr>
+          <w:b w:val="0"/>
+          <w:i w:val="0"/>
+          <w:sz w:val="21"/>
+        </w:rPr>
+        <w:t>页面顶部新增的个人持仓面板，数据来自你的券商（Midas）截图：</w:t>
+      </w:r>
+    </w:p>
+    <w:p>
+      <w:pPr>
+        <w:pStyle w:val="ListBullet"/>
+      </w:pPr>
+      <w:r>
+        <w:t>四张汇总卡：总资产（≈USD）、美股 ABD、土耳其股 BIST、现金，均含当日盈亏。</w:t>
+      </w:r>
+    </w:p>
+    <w:p>
+      <w:pPr>
+        <w:pStyle w:val="ListBullet"/>
+      </w:pPr>
+      <w:r>
+        <w:t>一条占比色条 + 图例，显示各标的在总资产中的权重。</w:t>
+      </w:r>
+    </w:p>
+    <w:p>
+      <w:pPr>
+        <w:pStyle w:val="ListBullet"/>
+      </w:pPr>
+      <w:r>
+        <w:t>持仓明细表：标的 / 市场 / 持股 / 现价 / 日涨跌 / 持仓市值 / ≈USD / 占比 / 数据来源。</w:t>
+      </w:r>
+    </w:p>
+    <w:p>
+      <w:r>
+        <w:rPr>
+          <w:b w:val="0"/>
+          <w:i w:val="0"/>
+          <w:color w:val="606060"/>
+          <w:sz w:val="19"/>
+        </w:rPr>
+        <w:t>美股（QQQ、VOO）走 Finnhub 实时（标「实时」）；土耳其 BIST 三只（BIMAS、ASELS、ASTOR）免费层无实时，按截图快照显示（标「截图」）。要更新持仓：用文本编辑器打开 index.html，搜索 const PORTFOLIO，按格式修改持股、价格、当日涨跌；汇率改 FX_TRY_USD。</w:t>
       </w:r>
     </w:p>
     <w:p>

</xml_diff>

<commit_message>
Add money cockpit: allocation blueprint, risk calculator, trade journal
Three capital-preservation tools tailored to a small ($3,000), long-hold,
risk-first profile:
- Allocation blueprint: core/satellite/speculative split with presets and
  per-position caps
- Position & risk calculator: 1% rule -> max loss, share count, R:R, targets
- Trade journal (localStorage): win rate, payoff, expectancy, cumulative P/L
Tools enforce discipline and risk control; they do not promise profit.
Tutorial doc updated with the three tools.
</commit_message>
<xml_diff>
--- a/Serenity-卡点仪表盘/使用教程.docx
+++ b/Serenity-卡点仪表盘/使用教程.docx
@@ -245,6 +245,114 @@
           <w:sz w:val="19"/>
         </w:rPr>
         <w:t>美股（QQQ、VOO）走 Finnhub 实时（标「实时」）；土耳其 BIST 三只（BIMAS、ASELS、ASTOR）免费层无实时，按截图快照显示（标「截图」）。要更新持仓：用文本编辑器打开 index.html，搜索 const PORTFOLIO，按格式修改持股、价格、当日涨跌；汇率改 FX_TRY_USD。</w:t>
+      </w:r>
+    </w:p>
+    <w:p>
+      <w:pPr>
+        <w:pStyle w:val="Heading2"/>
+      </w:pPr>
+      <w:r>
+        <w:t>0b. 资产配置蓝图（$3,000 怎么分）</w:t>
+      </w:r>
+    </w:p>
+    <w:p>
+      <w:r>
+        <w:rPr>
+          <w:b w:val="0"/>
+          <w:i w:val="0"/>
+          <w:sz w:val="21"/>
+        </w:rPr>
+        <w:t>把账户分成三桶：核心稳健（宽基 ETF 打底）、卫星成长（质优成长 / Serenity A 档）、投机高波动（卡点小盘 / BIST / 加密）。提供「保守 75/20/5」「稳健 70/20/10」「进取 50/30/20」三档预设，自动算出每桶金额，并给出关键纪律：单只投机仓 ≤ 账户 5%、投机总仓有上限。</w:t>
+      </w:r>
+    </w:p>
+    <w:p>
+      <w:pPr>
+        <w:pStyle w:val="Heading2"/>
+      </w:pPr>
+      <w:r>
+        <w:t>0c. 仓位与风险计算器（最重要）</w:t>
+      </w:r>
+    </w:p>
+    <w:p>
+      <w:r>
+        <w:rPr>
+          <w:b w:val="0"/>
+          <w:i w:val="0"/>
+          <w:sz w:val="21"/>
+        </w:rPr>
+        <w:t>买之前先算清楚风险。输入账户规模、单笔风险%（默认 1%）、入场价、止损价、目标价，立即得出：</w:t>
+      </w:r>
+    </w:p>
+    <w:p>
+      <w:pPr>
+        <w:pStyle w:val="ListBullet"/>
+      </w:pPr>
+      <w:r>
+        <w:t>单笔最大风险（如 $3,000 的 1% = $30）</w:t>
+      </w:r>
+    </w:p>
+    <w:p>
+      <w:pPr>
+        <w:pStyle w:val="ListBullet"/>
+      </w:pPr>
+      <w:r>
+        <w:t>建议买入股数 = 最大风险 ÷ 每股风险</w:t>
+      </w:r>
+    </w:p>
+    <w:p>
+      <w:pPr>
+        <w:pStyle w:val="ListBullet"/>
+      </w:pPr>
+      <w:r>
+        <w:t>仓位价值与占账户比例、触发止损的实际亏损</w:t>
+      </w:r>
+    </w:p>
+    <w:p>
+      <w:pPr>
+        <w:pStyle w:val="ListBullet"/>
+      </w:pPr>
+      <w:r>
+        <w:t>盈亏比 R:R，以及 1R/2R/3R 分批止盈参考价</w:t>
+      </w:r>
+    </w:p>
+    <w:p>
+      <w:r>
+        <w:rPr>
+          <w:b w:val="0"/>
+          <w:i/>
+          <w:color w:val="606060"/>
+          <w:sz w:val="19"/>
+        </w:rPr>
+        <w:t>铁律：盈亏比 &lt; 2:1 的交易尽量别做；止损设好后只能上移、不能下挪。这是小账户活下来的第一要素。</w:t>
+      </w:r>
+    </w:p>
+    <w:p>
+      <w:pPr>
+        <w:pStyle w:val="Heading2"/>
+      </w:pPr>
+      <w:r>
+        <w:t>0d. 交易日志与绩效</w:t>
+      </w:r>
+    </w:p>
+    <w:p>
+      <w:r>
+        <w:rPr>
+          <w:b w:val="0"/>
+          <w:i w:val="0"/>
+          <w:sz w:val="21"/>
+        </w:rPr>
+        <w:t>记录每一笔交易（标的 / 方向 / 股数 / 入场 / 出场 / 日期 / 备注），自动统计：累计已实现盈亏、胜率、盈亏比（均盈/均亏）、每笔期望值。出场价留空 = 持仓中。数据保存在你本机浏览器（localStorage），可「载入示例」预览、「清空日志」重来。期望值 &gt; 0，才是长期能赚钱的系统。</w:t>
+      </w:r>
+    </w:p>
+    <w:p>
+      <w:r>
+        <w:rPr>
+          <w:b/>
+          <w:i w:val="0"/>
+          <w:color w:val="606060"/>
+          <w:sz w:val="19"/>
+        </w:rPr>
+        <w:t>注意：这些工具帮你控制风险、保持纪律、复盘提升，但不保证盈利——盈亏取决于市场和你自己的决策。</w:t>
       </w:r>
     </w:p>
     <w:p>

</xml_diff>

<commit_message>
Add compounding simulator, price alerts, and portfolio diagnostics
- Tool 4: compounding vs drawdown simulator with dual equity curves and
  recovery math, driving home that one large loss dwarfs steady gains
- Tool 5: price alerts (>=target / <=stop) checked on each live refresh,
  with optional desktop notifications; alert tickers added to fetch set
- Tool 6: one-click portfolio diagnostics — buckets actual vs target
  allocation, flags over-concentration and missing stops
Live pipeline (EXTRA hook) re-runs alerts + diagnostics on every refresh.
Tutorial updated.
</commit_message>
<xml_diff>
--- a/Serenity-卡点仪表盘/使用教程.docx
+++ b/Serenity-卡点仪表盘/使用教程.docx
@@ -353,6 +353,60 @@
           <w:sz w:val="19"/>
         </w:rPr>
         <w:t>注意：这些工具帮你控制风险、保持纪律、复盘提升，但不保证盈利——盈亏取决于市场和你自己的决策。</w:t>
+      </w:r>
+    </w:p>
+    <w:p>
+      <w:pPr>
+        <w:pStyle w:val="Heading2"/>
+      </w:pPr>
+      <w:r>
+        <w:t>0e. 复利 vs 回撤模拟器</w:t>
+      </w:r>
+    </w:p>
+    <w:p>
+      <w:r>
+        <w:rPr>
+          <w:b w:val="0"/>
+          <w:i w:val="0"/>
+          <w:sz w:val="21"/>
+        </w:rPr>
+        <w:t>输入本金、月均收益%、月数、以及中途一次回撤%，画出「纪律线 vs 踩雷线」两条净值曲线，直观看清一次大亏的代价，并给出回撤恢复数学（亏 X% 要赚 X/(1-X) 才回本）。例：$3,000 每月 +3% 滚 24 个月 ≈ $6,098；若中途一次 -50%，终值只剩 ≈ $3,049。核心结论：保住本金 &gt; 追求暴利。</w:t>
+      </w:r>
+    </w:p>
+    <w:p>
+      <w:pPr>
+        <w:pStyle w:val="Heading2"/>
+      </w:pPr>
+      <w:r>
+        <w:t>0f. 价格预警</w:t>
+      </w:r>
+    </w:p>
+    <w:p>
+      <w:r>
+        <w:rPr>
+          <w:b w:val="0"/>
+          <w:i w:val="0"/>
+          <w:sz w:val="21"/>
+        </w:rPr>
+        <w:t>为盯住的标的设「≥ 目标价 / ≤ 止损价」。每次刷新行情时自动检查，触发即高亮；点「🔔 桌面通知」授权后，触发会弹系统通知。预警保存在本机浏览器，仅美股有实时价。</w:t>
+      </w:r>
+    </w:p>
+    <w:p>
+      <w:pPr>
+        <w:pStyle w:val="Heading2"/>
+      </w:pPr>
+      <w:r>
+        <w:t>0g. 持仓诊断（一键体检）</w:t>
+      </w:r>
+    </w:p>
+    <w:p>
+      <w:r>
+        <w:rPr>
+          <w:b w:val="0"/>
+          <w:i w:val="0"/>
+          <w:sz w:val="21"/>
+        </w:rPr>
+        <w:t>把「我的持仓」自动分桶（核心 / 卫星 / 投机），对照你选的配置蓝图，逐条给出诊断：哪只投机仓超过 5% 单仓上限、投机总仓是否超配、成长仓是否不足、以及"为每个持仓设止损、单笔最大亏损 ≤ 账户 1%"的待办提醒。随实时行情自动刷新结论。</w:t>
       </w:r>
     </w:p>
     <w:p>

</xml_diff>

<commit_message>
Close the stop-loss loop: inline stop prices + risk exposure + diagnostics
- Portfolio table gains editable 止损价 (stop) column (persisted in
  localStorage) and a live 风险敞口 column showing $ and % at risk if stopped
- Diagnostics now read per-holding stops: flag missing stops on satellite/
  speculative buckets, note core ETFs can use a disaster stop, and warn on
  stops that exceed the 1% rule or sit above current price
- Stop edits re-run portfolio + diagnostics instantly; updated log and guide
</commit_message>
<xml_diff>
--- a/Serenity-卡点仪表盘/使用教程.docx
+++ b/Serenity-卡点仪表盘/使用教程.docx
@@ -406,7 +406,18 @@
           <w:i w:val="0"/>
           <w:sz w:val="21"/>
         </w:rPr>
-        <w:t>把「我的持仓」自动分桶（核心 / 卫星 / 投机），对照你选的配置蓝图，逐条给出诊断：哪只投机仓超过 5% 单仓上限、投机总仓是否超配、成长仓是否不足、以及"为每个持仓设止损、单笔最大亏损 ≤ 账户 1%"的待办提醒。随实时行情自动刷新结论。</w:t>
+        <w:t>把「我的持仓」自动分桶（核心 / 卫星 / 投机），对照你选的配置蓝图，逐条给出诊断：哪只投机仓超过 5% 单仓上限、投机总仓是否超配、成长仓是否不足等。随实时行情自动刷新结论。</w:t>
+      </w:r>
+    </w:p>
+    <w:p>
+      <w:r>
+        <w:rPr>
+          <w:b w:val="0"/>
+          <w:i w:val="0"/>
+          <w:color w:val="606060"/>
+          <w:sz w:val="19"/>
+        </w:rPr>
+        <w:t>止损闭环：在「我的持仓」表的「止损价」列直接给每个持仓填止损（保存在本机浏览器），右侧「风险敞口」列实时显示一旦触发止损会亏多少（金额与占账户%）。诊断会自动区分核心 ETF（长期持有可不设硬止损，建议挂 -20% 灾难止损）与卫星/投机仓（必须设止损），并标出缺止损、止损过宽（单笔 &gt; 账户 1%）、止损无效（≥ 现价）等问题。</w:t>
       </w:r>
     </w:p>
     <w:p>

</xml_diff>